<commit_message>
SCRUM-32: Resolve Fraud Case open decisions (Q1-Q7) and add account ID mapping
- Account ID mapping reference table (A0001/A00001/A0000001 -> A0000001) with generator, validator and tests
- Member 360: DQ-11 requires every core banking account in the mapping table
- Fraud Case: account_found_flag, SLA by priority (sla_days, sla_breached_flag), DQ-13 routing (optional),
  DQ-14 member match-rate gate, ET timezone in contract, daily status snapshot
- BREAKING: CRITICAL_CASE_AGED replaced by CASE_SLA_BREACHED; fraud_case 20 -> 23 columns
- Framework: Warehouse.replace_partition, Rule.applies; copies kept identical by test
- Unit test case documents (Member 360 130/130, Fraud Case 127/127) generated from real pytest runs
- OpenSpec change resolve-fraud-case-open-decisions and synced specs

Co-Authored-By: Claude Opus 5.5 <noreply@anthropic.com>
</commit_message>
<xml_diff>
--- a/output/DP_Fraud_Case/PRD_Fraud_Case.docx
+++ b/output/DP_Fraud_Case/PRD_Fraud_Case.docx
@@ -189,7 +189,7 @@
               <w:rPr>
                 <w:sz w:val="17"/>
               </w:rPr>
-              <w:t>SCRUM-25 (Feature epic) · stories SCRUM-26 to SCRUM-31 (FR-01 to FR-06)</w:t>
+              <w:t>SCRUM-25 (Feature epic) · stories SCRUM-26 to SCRUM-32 (FR-01 to FR-07)</w:t>
             </w:r>
           </w:p>
         </w:tc>
@@ -907,7 +907,7 @@
         <w:pStyle w:val="ListBullet"/>
       </w:pPr>
       <w:r>
-        <w:t>Member link to member_360 (keep and flag unmatched).</w:t>
+        <w:t>Member link to member_360 and account link via the account ID mapping reference table (keep and flag unmatched).</w:t>
       </w:r>
     </w:p>
     <w:p>
@@ -915,7 +915,15 @@
         <w:pStyle w:val="ListBullet"/>
       </w:pPr>
       <w:r>
-        <w:t>Derived metrics (section 6).</w:t>
+        <w:t>Derived metrics and SLA by priority (section 6).</w:t>
+      </w:r>
+    </w:p>
+    <w:p>
+      <w:pPr>
+        <w:pStyle w:val="ListBullet"/>
+      </w:pPr>
+      <w:r>
+        <w:t>Daily case status snapshot (history from go-live).</w:t>
       </w:r>
     </w:p>
     <w:p>
@@ -939,7 +947,15 @@
         <w:pStyle w:val="ListBullet"/>
       </w:pPr>
       <w:r>
-        <w:t>Account linkage (account ID formats differ – see Q2).</w:t>
+        <w:t>Rebuilding status history before go-live.</w:t>
+      </w:r>
+    </w:p>
+    <w:p>
+      <w:pPr>
+        <w:pStyle w:val="ListBullet"/>
+      </w:pPr>
+      <w:r>
+        <w:t>Enforcing queue routing (optional DQ-13 check only).</w:t>
       </w:r>
     </w:p>
     <w:p>
@@ -1664,7 +1680,7 @@
               <w:rPr>
                 <w:sz w:val="17"/>
               </w:rPr>
-              <w:t>Parse M/D/YYYY H:MM. Time zone not stated.</w:t>
+              <w:t>Parse M/D/YYYY H:MM. US Eastern (America/New_York), no offset.</w:t>
             </w:r>
           </w:p>
         </w:tc>
@@ -2492,7 +2508,7 @@
               <w:rPr>
                 <w:sz w:val="17"/>
               </w:rPr>
-              <w:t>Blank unless Closed.</w:t>
+              <w:t>Blank unless Closed. US Eastern (ET).</w:t>
             </w:r>
           </w:p>
         </w:tc>
@@ -2725,6 +2741,631 @@
                 <w:sz w:val="17"/>
               </w:rPr>
               <w:t>Published by DP_Member_360.</w:t>
+            </w:r>
+          </w:p>
+        </w:tc>
+      </w:tr>
+    </w:tbl>
+    <w:p/>
+    <w:p>
+      <w:pPr>
+        <w:pStyle w:val="Heading2"/>
+      </w:pPr>
+      <w:r>
+        <w:t>5.3 Reference: account ID mapping table (sources/data/reference/account_id_map.csv)</w:t>
+      </w:r>
+    </w:p>
+    <w:p>
+      <w:pPr>
+        <w:pStyle w:val="ListBullet"/>
+      </w:pPr>
+      <w:r>
+        <w:t>Shared reference data (SCRUM-32), built and validated by tools/build_account_id_map.py and tools/validate_account_id_map.py.</w:t>
+      </w:r>
+    </w:p>
+    <w:p>
+      <w:pPr>
+        <w:pStyle w:val="ListBullet"/>
+      </w:pPr>
+      <w:r>
+        <w:t>One row per (source_system, source_account_id): one-to-one within a system, many-to-one across systems.</w:t>
+      </w:r>
+    </w:p>
+    <w:p>
+      <w:pPr>
+        <w:pStyle w:val="ListBullet"/>
+      </w:pPr>
+      <w:r>
+        <w:t>Fraud Case reads the fraud_case_mgmt rows to set account_found_flag.</w:t>
+      </w:r>
+    </w:p>
+    <w:tbl>
+      <w:tblPr>
+        <w:tblStyle w:val="TableGrid"/>
+        <w:tblW w:type="auto" w:w="0"/>
+        <w:tblLook w:firstColumn="1" w:firstRow="1" w:lastColumn="0" w:lastRow="0" w:noHBand="0" w:noVBand="1" w:val="04A0"/>
+      </w:tblPr>
+      <w:tblGrid>
+        <w:gridCol w:w="1234"/>
+        <w:gridCol w:w="1234"/>
+        <w:gridCol w:w="1234"/>
+        <w:gridCol w:w="1234"/>
+        <w:gridCol w:w="1234"/>
+        <w:gridCol w:w="1234"/>
+        <w:gridCol w:w="1234"/>
+      </w:tblGrid>
+      <w:tr>
+        <w:tc>
+          <w:tcPr>
+            <w:tcW w:type="dxa" w:w="1234"/>
+            <w:shd w:val="clear" w:color="auto" w:fill="7B2C2C"/>
+          </w:tcPr>
+          <w:p>
+            <w:r>
+              <w:rPr>
+                <w:b/>
+                <w:color w:val="FFFFFF"/>
+                <w:sz w:val="18"/>
+              </w:rPr>
+              <w:t>Column</w:t>
+            </w:r>
+          </w:p>
+        </w:tc>
+        <w:tc>
+          <w:tcPr>
+            <w:tcW w:type="dxa" w:w="1234"/>
+            <w:shd w:val="clear" w:color="auto" w:fill="7B2C2C"/>
+          </w:tcPr>
+          <w:p>
+            <w:r>
+              <w:rPr>
+                <w:b/>
+                <w:color w:val="FFFFFF"/>
+                <w:sz w:val="18"/>
+              </w:rPr>
+              <w:t>Logical type</w:t>
+            </w:r>
+          </w:p>
+        </w:tc>
+        <w:tc>
+          <w:tcPr>
+            <w:tcW w:type="dxa" w:w="1234"/>
+            <w:shd w:val="clear" w:color="auto" w:fill="7B2C2C"/>
+          </w:tcPr>
+          <w:p>
+            <w:r>
+              <w:rPr>
+                <w:b/>
+                <w:color w:val="FFFFFF"/>
+                <w:sz w:val="18"/>
+              </w:rPr>
+              <w:t>Physical type</w:t>
+            </w:r>
+          </w:p>
+        </w:tc>
+        <w:tc>
+          <w:tcPr>
+            <w:tcW w:type="dxa" w:w="1234"/>
+            <w:shd w:val="clear" w:color="auto" w:fill="7B2C2C"/>
+          </w:tcPr>
+          <w:p>
+            <w:r>
+              <w:rPr>
+                <w:b/>
+                <w:color w:val="FFFFFF"/>
+                <w:sz w:val="18"/>
+              </w:rPr>
+              <w:t>Null?</w:t>
+            </w:r>
+          </w:p>
+        </w:tc>
+        <w:tc>
+          <w:tcPr>
+            <w:tcW w:type="dxa" w:w="1234"/>
+            <w:shd w:val="clear" w:color="auto" w:fill="7B2C2C"/>
+          </w:tcPr>
+          <w:p>
+            <w:r>
+              <w:rPr>
+                <w:b/>
+                <w:color w:val="FFFFFF"/>
+                <w:sz w:val="18"/>
+              </w:rPr>
+              <w:t>Key</w:t>
+            </w:r>
+          </w:p>
+        </w:tc>
+        <w:tc>
+          <w:tcPr>
+            <w:tcW w:type="dxa" w:w="1234"/>
+            <w:shd w:val="clear" w:color="auto" w:fill="7B2C2C"/>
+          </w:tcPr>
+          <w:p>
+            <w:r>
+              <w:rPr>
+                <w:b/>
+                <w:color w:val="FFFFFF"/>
+                <w:sz w:val="18"/>
+              </w:rPr>
+              <w:t>Example (raw)</w:t>
+            </w:r>
+          </w:p>
+        </w:tc>
+        <w:tc>
+          <w:tcPr>
+            <w:tcW w:type="dxa" w:w="1234"/>
+            <w:shd w:val="clear" w:color="auto" w:fill="7B2C2C"/>
+          </w:tcPr>
+          <w:p>
+            <w:r>
+              <w:rPr>
+                <w:b/>
+                <w:color w:val="FFFFFF"/>
+                <w:sz w:val="18"/>
+              </w:rPr>
+              <w:t>Description / conversion rule</w:t>
+            </w:r>
+          </w:p>
+        </w:tc>
+      </w:tr>
+      <w:tr>
+        <w:tc>
+          <w:tcPr>
+            <w:tcW w:type="dxa" w:w="1234"/>
+          </w:tcPr>
+          <w:p>
+            <w:r>
+              <w:rPr>
+                <w:sz w:val="17"/>
+              </w:rPr>
+              <w:t>source_system</w:t>
+            </w:r>
+          </w:p>
+        </w:tc>
+        <w:tc>
+          <w:tcPr>
+            <w:tcW w:type="dxa" w:w="1234"/>
+          </w:tcPr>
+          <w:p>
+            <w:r>
+              <w:rPr>
+                <w:sz w:val="17"/>
+              </w:rPr>
+              <w:t>Category</w:t>
+            </w:r>
+          </w:p>
+        </w:tc>
+        <w:tc>
+          <w:tcPr>
+            <w:tcW w:type="dxa" w:w="1234"/>
+          </w:tcPr>
+          <w:p>
+            <w:r>
+              <w:rPr>
+                <w:sz w:val="17"/>
+              </w:rPr>
+              <w:t>VARCHAR(30)</w:t>
+            </w:r>
+          </w:p>
+        </w:tc>
+        <w:tc>
+          <w:tcPr>
+            <w:tcW w:type="dxa" w:w="1234"/>
+          </w:tcPr>
+          <w:p>
+            <w:r>
+              <w:rPr>
+                <w:sz w:val="17"/>
+              </w:rPr>
+              <w:t>N</w:t>
+            </w:r>
+          </w:p>
+        </w:tc>
+        <w:tc>
+          <w:tcPr>
+            <w:tcW w:type="dxa" w:w="1234"/>
+          </w:tcPr>
+          <w:p>
+            <w:r>
+              <w:rPr>
+                <w:sz w:val="17"/>
+              </w:rPr>
+              <w:t>PK</w:t>
+            </w:r>
+          </w:p>
+        </w:tc>
+        <w:tc>
+          <w:tcPr>
+            <w:tcW w:type="dxa" w:w="1234"/>
+          </w:tcPr>
+          <w:p>
+            <w:r>
+              <w:rPr>
+                <w:sz w:val="17"/>
+              </w:rPr>
+              <w:t>fraud_case_mgmt</w:t>
+            </w:r>
+          </w:p>
+        </w:tc>
+        <w:tc>
+          <w:tcPr>
+            <w:tcW w:type="dxa" w:w="1234"/>
+          </w:tcPr>
+          <w:p>
+            <w:r>
+              <w:rPr>
+                <w:sz w:val="17"/>
+              </w:rPr>
+              <w:t>System the ID comes from.</w:t>
+            </w:r>
+          </w:p>
+        </w:tc>
+      </w:tr>
+      <w:tr>
+        <w:tc>
+          <w:tcPr>
+            <w:tcW w:type="dxa" w:w="1234"/>
+          </w:tcPr>
+          <w:p>
+            <w:r>
+              <w:rPr>
+                <w:sz w:val="17"/>
+              </w:rPr>
+              <w:t>source_account_id</w:t>
+            </w:r>
+          </w:p>
+        </w:tc>
+        <w:tc>
+          <w:tcPr>
+            <w:tcW w:type="dxa" w:w="1234"/>
+          </w:tcPr>
+          <w:p>
+            <w:r>
+              <w:rPr>
+                <w:sz w:val="17"/>
+              </w:rPr>
+              <w:t>Identifier</w:t>
+            </w:r>
+          </w:p>
+        </w:tc>
+        <w:tc>
+          <w:tcPr>
+            <w:tcW w:type="dxa" w:w="1234"/>
+          </w:tcPr>
+          <w:p>
+            <w:r>
+              <w:rPr>
+                <w:sz w:val="17"/>
+              </w:rPr>
+              <w:t>VARCHAR(12)</w:t>
+            </w:r>
+          </w:p>
+        </w:tc>
+        <w:tc>
+          <w:tcPr>
+            <w:tcW w:type="dxa" w:w="1234"/>
+          </w:tcPr>
+          <w:p>
+            <w:r>
+              <w:rPr>
+                <w:sz w:val="17"/>
+              </w:rPr>
+              <w:t>N</w:t>
+            </w:r>
+          </w:p>
+        </w:tc>
+        <w:tc>
+          <w:tcPr>
+            <w:tcW w:type="dxa" w:w="1234"/>
+          </w:tcPr>
+          <w:p>
+            <w:r>
+              <w:rPr>
+                <w:sz w:val="17"/>
+              </w:rPr>
+              <w:t>PK</w:t>
+            </w:r>
+          </w:p>
+        </w:tc>
+        <w:tc>
+          <w:tcPr>
+            <w:tcW w:type="dxa" w:w="1234"/>
+          </w:tcPr>
+          <w:p>
+            <w:r>
+              <w:rPr>
+                <w:sz w:val="17"/>
+              </w:rPr>
+              <w:t>A0000001</w:t>
+            </w:r>
+          </w:p>
+        </w:tc>
+        <w:tc>
+          <w:tcPr>
+            <w:tcW w:type="dxa" w:w="1234"/>
+          </w:tcPr>
+          <w:p>
+            <w:r>
+              <w:rPr>
+                <w:sz w:val="17"/>
+              </w:rPr>
+              <w:t>Account ID as that system writes it.</w:t>
+            </w:r>
+          </w:p>
+        </w:tc>
+      </w:tr>
+      <w:tr>
+        <w:tc>
+          <w:tcPr>
+            <w:tcW w:type="dxa" w:w="1234"/>
+          </w:tcPr>
+          <w:p>
+            <w:r>
+              <w:rPr>
+                <w:sz w:val="17"/>
+              </w:rPr>
+              <w:t>account_id</w:t>
+            </w:r>
+          </w:p>
+        </w:tc>
+        <w:tc>
+          <w:tcPr>
+            <w:tcW w:type="dxa" w:w="1234"/>
+          </w:tcPr>
+          <w:p>
+            <w:r>
+              <w:rPr>
+                <w:sz w:val="17"/>
+              </w:rPr>
+              <w:t>Identifier</w:t>
+            </w:r>
+          </w:p>
+        </w:tc>
+        <w:tc>
+          <w:tcPr>
+            <w:tcW w:type="dxa" w:w="1234"/>
+          </w:tcPr>
+          <w:p>
+            <w:r>
+              <w:rPr>
+                <w:sz w:val="17"/>
+              </w:rPr>
+              <w:t>VARCHAR(10)</w:t>
+            </w:r>
+          </w:p>
+        </w:tc>
+        <w:tc>
+          <w:tcPr>
+            <w:tcW w:type="dxa" w:w="1234"/>
+          </w:tcPr>
+          <w:p>
+            <w:r>
+              <w:rPr>
+                <w:sz w:val="17"/>
+              </w:rPr>
+              <w:t>N</w:t>
+            </w:r>
+          </w:p>
+        </w:tc>
+        <w:tc>
+          <w:tcPr>
+            <w:tcW w:type="dxa" w:w="1234"/>
+          </w:tcPr>
+          <w:p>
+            <w:r>
+              <w:rPr>
+                <w:sz w:val="17"/>
+              </w:rPr>
+            </w:r>
+          </w:p>
+        </w:tc>
+        <w:tc>
+          <w:tcPr>
+            <w:tcW w:type="dxa" w:w="1234"/>
+          </w:tcPr>
+          <w:p>
+            <w:r>
+              <w:rPr>
+                <w:sz w:val="17"/>
+              </w:rPr>
+              <w:t>A0000001</w:t>
+            </w:r>
+          </w:p>
+        </w:tc>
+        <w:tc>
+          <w:tcPr>
+            <w:tcW w:type="dxa" w:w="1234"/>
+          </w:tcPr>
+          <w:p>
+            <w:r>
+              <w:rPr>
+                <w:sz w:val="17"/>
+              </w:rPr>
+              <w:t>Canonical ^A\d{7}$ (zero-padded: A0001, A00001 → A0000001).</w:t>
+            </w:r>
+          </w:p>
+        </w:tc>
+      </w:tr>
+      <w:tr>
+        <w:tc>
+          <w:tcPr>
+            <w:tcW w:type="dxa" w:w="1234"/>
+          </w:tcPr>
+          <w:p>
+            <w:r>
+              <w:rPr>
+                <w:sz w:val="17"/>
+              </w:rPr>
+              <w:t>in_core_banking</w:t>
+            </w:r>
+          </w:p>
+        </w:tc>
+        <w:tc>
+          <w:tcPr>
+            <w:tcW w:type="dxa" w:w="1234"/>
+          </w:tcPr>
+          <w:p>
+            <w:r>
+              <w:rPr>
+                <w:sz w:val="17"/>
+              </w:rPr>
+              <w:t>Boolean</w:t>
+            </w:r>
+          </w:p>
+        </w:tc>
+        <w:tc>
+          <w:tcPr>
+            <w:tcW w:type="dxa" w:w="1234"/>
+          </w:tcPr>
+          <w:p>
+            <w:r>
+              <w:rPr>
+                <w:sz w:val="17"/>
+              </w:rPr>
+              <w:t>BOOLEAN</w:t>
+            </w:r>
+          </w:p>
+        </w:tc>
+        <w:tc>
+          <w:tcPr>
+            <w:tcW w:type="dxa" w:w="1234"/>
+          </w:tcPr>
+          <w:p>
+            <w:r>
+              <w:rPr>
+                <w:sz w:val="17"/>
+              </w:rPr>
+              <w:t>N</w:t>
+            </w:r>
+          </w:p>
+        </w:tc>
+        <w:tc>
+          <w:tcPr>
+            <w:tcW w:type="dxa" w:w="1234"/>
+          </w:tcPr>
+          <w:p>
+            <w:r>
+              <w:rPr>
+                <w:sz w:val="17"/>
+              </w:rPr>
+            </w:r>
+          </w:p>
+        </w:tc>
+        <w:tc>
+          <w:tcPr>
+            <w:tcW w:type="dxa" w:w="1234"/>
+          </w:tcPr>
+          <w:p>
+            <w:r>
+              <w:rPr>
+                <w:sz w:val="17"/>
+              </w:rPr>
+              <w:t>TRUE</w:t>
+            </w:r>
+          </w:p>
+        </w:tc>
+        <w:tc>
+          <w:tcPr>
+            <w:tcW w:type="dxa" w:w="1234"/>
+          </w:tcPr>
+          <w:p>
+            <w:r>
+              <w:rPr>
+                <w:sz w:val="17"/>
+              </w:rPr>
+              <w:t>Canonical ID exists in core banking.</w:t>
+            </w:r>
+          </w:p>
+        </w:tc>
+      </w:tr>
+      <w:tr>
+        <w:tc>
+          <w:tcPr>
+            <w:tcW w:type="dxa" w:w="1234"/>
+          </w:tcPr>
+          <w:p>
+            <w:r>
+              <w:rPr>
+                <w:sz w:val="17"/>
+              </w:rPr>
+              <w:t>mapping_rule</w:t>
+            </w:r>
+          </w:p>
+        </w:tc>
+        <w:tc>
+          <w:tcPr>
+            <w:tcW w:type="dxa" w:w="1234"/>
+          </w:tcPr>
+          <w:p>
+            <w:r>
+              <w:rPr>
+                <w:sz w:val="17"/>
+              </w:rPr>
+              <w:t>Category</w:t>
+            </w:r>
+          </w:p>
+        </w:tc>
+        <w:tc>
+          <w:tcPr>
+            <w:tcW w:type="dxa" w:w="1234"/>
+          </w:tcPr>
+          <w:p>
+            <w:r>
+              <w:rPr>
+                <w:sz w:val="17"/>
+              </w:rPr>
+              <w:t>VARCHAR(40)</w:t>
+            </w:r>
+          </w:p>
+        </w:tc>
+        <w:tc>
+          <w:tcPr>
+            <w:tcW w:type="dxa" w:w="1234"/>
+          </w:tcPr>
+          <w:p>
+            <w:r>
+              <w:rPr>
+                <w:sz w:val="17"/>
+              </w:rPr>
+              <w:t>N</w:t>
+            </w:r>
+          </w:p>
+        </w:tc>
+        <w:tc>
+          <w:tcPr>
+            <w:tcW w:type="dxa" w:w="1234"/>
+          </w:tcPr>
+          <w:p>
+            <w:r>
+              <w:rPr>
+                <w:sz w:val="17"/>
+              </w:rPr>
+            </w:r>
+          </w:p>
+        </w:tc>
+        <w:tc>
+          <w:tcPr>
+            <w:tcW w:type="dxa" w:w="1234"/>
+          </w:tcPr>
+          <w:p>
+            <w:r>
+              <w:rPr>
+                <w:sz w:val="17"/>
+              </w:rPr>
+              <w:t>pad_to_7_digits</w:t>
+            </w:r>
+          </w:p>
+        </w:tc>
+        <w:tc>
+          <w:tcPr>
+            <w:tcW w:type="dxa" w:w="1234"/>
+          </w:tcPr>
+          <w:p>
+            <w:r>
+              <w:rPr>
+                <w:sz w:val="17"/>
+              </w:rPr>
+              <w:t>Rule used to derive account_id.</w:t>
             </w:r>
           </w:p>
         </w:tc>
@@ -4567,6 +5208,282 @@
               <w:rPr>
                 <w:sz w:val="17"/>
               </w:rPr>
+              <w:t>account_found_flag</w:t>
+            </w:r>
+          </w:p>
+        </w:tc>
+        <w:tc>
+          <w:tcPr>
+            <w:tcW w:type="dxa" w:w="1234"/>
+          </w:tcPr>
+          <w:p>
+            <w:r>
+              <w:rPr>
+                <w:sz w:val="17"/>
+              </w:rPr>
+              <w:t>Boolean</w:t>
+            </w:r>
+          </w:p>
+        </w:tc>
+        <w:tc>
+          <w:tcPr>
+            <w:tcW w:type="dxa" w:w="1234"/>
+          </w:tcPr>
+          <w:p>
+            <w:r>
+              <w:rPr>
+                <w:sz w:val="17"/>
+              </w:rPr>
+              <w:t>BOOLEAN</w:t>
+            </w:r>
+          </w:p>
+        </w:tc>
+        <w:tc>
+          <w:tcPr>
+            <w:tcW w:type="dxa" w:w="1234"/>
+          </w:tcPr>
+          <w:p>
+            <w:r>
+              <w:rPr>
+                <w:sz w:val="17"/>
+              </w:rPr>
+              <w:t>N</w:t>
+            </w:r>
+          </w:p>
+        </w:tc>
+        <w:tc>
+          <w:tcPr>
+            <w:tcW w:type="dxa" w:w="1234"/>
+          </w:tcPr>
+          <w:p>
+            <w:r>
+              <w:rPr>
+                <w:sz w:val="17"/>
+              </w:rPr>
+            </w:r>
+          </w:p>
+        </w:tc>
+        <w:tc>
+          <w:tcPr>
+            <w:tcW w:type="dxa" w:w="1234"/>
+          </w:tcPr>
+          <w:p>
+            <w:r>
+              <w:rPr>
+                <w:sz w:val="17"/>
+              </w:rPr>
+              <w:t>TRUE / FALSE</w:t>
+            </w:r>
+          </w:p>
+        </w:tc>
+        <w:tc>
+          <w:tcPr>
+            <w:tcW w:type="dxa" w:w="1234"/>
+          </w:tcPr>
+          <w:p>
+            <w:r>
+              <w:rPr>
+                <w:sz w:val="17"/>
+              </w:rPr>
+              <w:t>Account exists in core banking (via account_id_map).</w:t>
+            </w:r>
+          </w:p>
+        </w:tc>
+      </w:tr>
+      <w:tr>
+        <w:tc>
+          <w:tcPr>
+            <w:tcW w:type="dxa" w:w="1234"/>
+          </w:tcPr>
+          <w:p>
+            <w:r>
+              <w:rPr>
+                <w:sz w:val="17"/>
+              </w:rPr>
+              <w:t>sla_days</w:t>
+            </w:r>
+          </w:p>
+        </w:tc>
+        <w:tc>
+          <w:tcPr>
+            <w:tcW w:type="dxa" w:w="1234"/>
+          </w:tcPr>
+          <w:p>
+            <w:r>
+              <w:rPr>
+                <w:sz w:val="17"/>
+              </w:rPr>
+              <w:t>Integer</w:t>
+            </w:r>
+          </w:p>
+        </w:tc>
+        <w:tc>
+          <w:tcPr>
+            <w:tcW w:type="dxa" w:w="1234"/>
+          </w:tcPr>
+          <w:p>
+            <w:r>
+              <w:rPr>
+                <w:sz w:val="17"/>
+              </w:rPr>
+              <w:t>INT</w:t>
+            </w:r>
+          </w:p>
+        </w:tc>
+        <w:tc>
+          <w:tcPr>
+            <w:tcW w:type="dxa" w:w="1234"/>
+          </w:tcPr>
+          <w:p>
+            <w:r>
+              <w:rPr>
+                <w:sz w:val="17"/>
+              </w:rPr>
+              <w:t>N</w:t>
+            </w:r>
+          </w:p>
+        </w:tc>
+        <w:tc>
+          <w:tcPr>
+            <w:tcW w:type="dxa" w:w="1234"/>
+          </w:tcPr>
+          <w:p>
+            <w:r>
+              <w:rPr>
+                <w:sz w:val="17"/>
+              </w:rPr>
+            </w:r>
+          </w:p>
+        </w:tc>
+        <w:tc>
+          <w:tcPr>
+            <w:tcW w:type="dxa" w:w="1234"/>
+          </w:tcPr>
+          <w:p>
+            <w:r>
+              <w:rPr>
+                <w:sz w:val="17"/>
+              </w:rPr>
+              <w:t>30 / 45 / 60 / 90 by priority</w:t>
+            </w:r>
+          </w:p>
+        </w:tc>
+        <w:tc>
+          <w:tcPr>
+            <w:tcW w:type="dxa" w:w="1234"/>
+          </w:tcPr>
+          <w:p>
+            <w:r>
+              <w:rPr>
+                <w:sz w:val="17"/>
+              </w:rPr>
+              <w:t>SLA for the case priority (configurable).</w:t>
+            </w:r>
+          </w:p>
+        </w:tc>
+      </w:tr>
+      <w:tr>
+        <w:tc>
+          <w:tcPr>
+            <w:tcW w:type="dxa" w:w="1234"/>
+          </w:tcPr>
+          <w:p>
+            <w:r>
+              <w:rPr>
+                <w:sz w:val="17"/>
+              </w:rPr>
+              <w:t>sla_breached_flag</w:t>
+            </w:r>
+          </w:p>
+        </w:tc>
+        <w:tc>
+          <w:tcPr>
+            <w:tcW w:type="dxa" w:w="1234"/>
+          </w:tcPr>
+          <w:p>
+            <w:r>
+              <w:rPr>
+                <w:sz w:val="17"/>
+              </w:rPr>
+              <w:t>Boolean</w:t>
+            </w:r>
+          </w:p>
+        </w:tc>
+        <w:tc>
+          <w:tcPr>
+            <w:tcW w:type="dxa" w:w="1234"/>
+          </w:tcPr>
+          <w:p>
+            <w:r>
+              <w:rPr>
+                <w:sz w:val="17"/>
+              </w:rPr>
+              <w:t>BOOLEAN</w:t>
+            </w:r>
+          </w:p>
+        </w:tc>
+        <w:tc>
+          <w:tcPr>
+            <w:tcW w:type="dxa" w:w="1234"/>
+          </w:tcPr>
+          <w:p>
+            <w:r>
+              <w:rPr>
+                <w:sz w:val="17"/>
+              </w:rPr>
+              <w:t>N</w:t>
+            </w:r>
+          </w:p>
+        </w:tc>
+        <w:tc>
+          <w:tcPr>
+            <w:tcW w:type="dxa" w:w="1234"/>
+          </w:tcPr>
+          <w:p>
+            <w:r>
+              <w:rPr>
+                <w:sz w:val="17"/>
+              </w:rPr>
+            </w:r>
+          </w:p>
+        </w:tc>
+        <w:tc>
+          <w:tcPr>
+            <w:tcW w:type="dxa" w:w="1234"/>
+          </w:tcPr>
+          <w:p>
+            <w:r>
+              <w:rPr>
+                <w:sz w:val="17"/>
+              </w:rPr>
+              <w:t>TRUE / FALSE</w:t>
+            </w:r>
+          </w:p>
+        </w:tc>
+        <w:tc>
+          <w:tcPr>
+            <w:tcW w:type="dxa" w:w="1234"/>
+          </w:tcPr>
+          <w:p>
+            <w:r>
+              <w:rPr>
+                <w:sz w:val="17"/>
+              </w:rPr>
+              <w:t>Elapsed days (to close, or age if open) &gt; sla_days.</w:t>
+            </w:r>
+          </w:p>
+        </w:tc>
+      </w:tr>
+      <w:tr>
+        <w:tc>
+          <w:tcPr>
+            <w:tcW w:type="dxa" w:w="1234"/>
+          </w:tcPr>
+          <w:p>
+            <w:r>
+              <w:rPr>
+                <w:sz w:val="17"/>
+              </w:rPr>
               <w:t>dp_load_ts</w:t>
             </w:r>
           </w:p>
@@ -5811,6 +6728,168 @@
               <w:rPr>
                 <w:sz w:val="17"/>
               </w:rPr>
+              <w:t>account_found_flag</w:t>
+            </w:r>
+          </w:p>
+        </w:tc>
+        <w:tc>
+          <w:tcPr>
+            <w:tcW w:type="dxa" w:w="2160"/>
+          </w:tcPr>
+          <w:p>
+            <w:r>
+              <w:rPr>
+                <w:sz w:val="17"/>
+              </w:rPr>
+              <w:t>account_id_map (fraud_case_mgmt rows)</w:t>
+            </w:r>
+          </w:p>
+        </w:tc>
+        <w:tc>
+          <w:tcPr>
+            <w:tcW w:type="dxa" w:w="2160"/>
+          </w:tcPr>
+          <w:p>
+            <w:r>
+              <w:rPr>
+                <w:sz w:val="17"/>
+              </w:rPr>
+              <w:t>in_core_banking for primary_account_id; FALSE if unmapped. Kept and reported.</w:t>
+            </w:r>
+          </w:p>
+        </w:tc>
+        <w:tc>
+          <w:tcPr>
+            <w:tcW w:type="dxa" w:w="2160"/>
+          </w:tcPr>
+          <w:p>
+            <w:r>
+              <w:rPr>
+                <w:sz w:val="17"/>
+              </w:rPr>
+              <w:t>Mapped (lookup)</w:t>
+            </w:r>
+          </w:p>
+        </w:tc>
+      </w:tr>
+      <w:tr>
+        <w:tc>
+          <w:tcPr>
+            <w:tcW w:type="dxa" w:w="2160"/>
+          </w:tcPr>
+          <w:p>
+            <w:r>
+              <w:rPr>
+                <w:sz w:val="17"/>
+              </w:rPr>
+              <w:t>sla_days</w:t>
+            </w:r>
+          </w:p>
+        </w:tc>
+        <w:tc>
+          <w:tcPr>
+            <w:tcW w:type="dxa" w:w="2160"/>
+          </w:tcPr>
+          <w:p>
+            <w:r>
+              <w:rPr>
+                <w:sz w:val="17"/>
+              </w:rPr>
+              <w:t>priority</w:t>
+            </w:r>
+          </w:p>
+        </w:tc>
+        <w:tc>
+          <w:tcPr>
+            <w:tcW w:type="dxa" w:w="2160"/>
+          </w:tcPr>
+          <w:p>
+            <w:r>
+              <w:rPr>
+                <w:sz w:val="17"/>
+              </w:rPr>
+              <w:t>Settings.sla_days_by_priority[priority].</w:t>
+            </w:r>
+          </w:p>
+        </w:tc>
+        <w:tc>
+          <w:tcPr>
+            <w:tcW w:type="dxa" w:w="2160"/>
+          </w:tcPr>
+          <w:p>
+            <w:r>
+              <w:rPr>
+                <w:sz w:val="17"/>
+              </w:rPr>
+              <w:t>Mapped (rule)</w:t>
+            </w:r>
+          </w:p>
+        </w:tc>
+      </w:tr>
+      <w:tr>
+        <w:tc>
+          <w:tcPr>
+            <w:tcW w:type="dxa" w:w="2160"/>
+          </w:tcPr>
+          <w:p>
+            <w:r>
+              <w:rPr>
+                <w:sz w:val="17"/>
+              </w:rPr>
+              <w:t>sla_breached_flag</w:t>
+            </w:r>
+          </w:p>
+        </w:tc>
+        <w:tc>
+          <w:tcPr>
+            <w:tcW w:type="dxa" w:w="2160"/>
+          </w:tcPr>
+          <w:p>
+            <w:r>
+              <w:rPr>
+                <w:sz w:val="17"/>
+              </w:rPr>
+              <w:t>days_to_close / case_age_days, sla_days</w:t>
+            </w:r>
+          </w:p>
+        </w:tc>
+        <w:tc>
+          <w:tcPr>
+            <w:tcW w:type="dxa" w:w="2160"/>
+          </w:tcPr>
+          <w:p>
+            <w:r>
+              <w:rPr>
+                <w:sz w:val="17"/>
+              </w:rPr>
+              <w:t>Closed: days_to_close &gt; sla_days; open: case_age_days &gt; sla_days.</w:t>
+            </w:r>
+          </w:p>
+        </w:tc>
+        <w:tc>
+          <w:tcPr>
+            <w:tcW w:type="dxa" w:w="2160"/>
+          </w:tcPr>
+          <w:p>
+            <w:r>
+              <w:rPr>
+                <w:sz w:val="17"/>
+              </w:rPr>
+              <w:t>Mapped (rule)</w:t>
+            </w:r>
+          </w:p>
+        </w:tc>
+      </w:tr>
+      <w:tr>
+        <w:tc>
+          <w:tcPr>
+            <w:tcW w:type="dxa" w:w="2160"/>
+          </w:tcPr>
+          <w:p>
+            <w:r>
+              <w:rPr>
+                <w:sz w:val="17"/>
+              </w:rPr>
               <w:t>dp_load_ts / dp_batch_id</w:t>
             </w:r>
           </w:p>
@@ -6085,7 +7164,7 @@
               <w:rPr>
                 <w:sz w:val="17"/>
               </w:rPr>
-              <w:t>Flag each case's member_found_flag; keep unmatched cases and report them.</w:t>
+              <w:t>Flag member_found_flag; keep unmatched cases and report them; DQ-14 match-rate gate (off by default).</w:t>
             </w:r>
           </w:p>
         </w:tc>
@@ -6126,7 +7205,7 @@
               <w:rPr>
                 <w:sz w:val="17"/>
               </w:rPr>
-              <w:t>Calculate is_closed, days_to_close, case_age_days and loss_confirmation_ratio.</w:t>
+              <w:t>Calculate is_closed, days_to_close, case_age_days, loss_confirmation_ratio, sla_days and sla_breached_flag.</w:t>
             </w:r>
           </w:p>
         </w:tc>
@@ -6167,7 +7246,48 @@
               <w:rPr>
                 <w:sz w:val="17"/>
               </w:rPr>
-              <w:t>Publish the table, CSV, data contract and DDL; exception report; block publish on critical failures.</w:t>
+              <w:t>Publish the table, CSV, data contract (timezone ET) and DDL; exceptions; daily status snapshot; block publish on critical failures.</w:t>
+            </w:r>
+          </w:p>
+        </w:tc>
+      </w:tr>
+      <w:tr>
+        <w:tc>
+          <w:tcPr>
+            <w:tcW w:type="dxa" w:w="2880"/>
+          </w:tcPr>
+          <w:p>
+            <w:r>
+              <w:rPr>
+                <w:sz w:val="17"/>
+              </w:rPr>
+              <w:t>FR-07</w:t>
+            </w:r>
+          </w:p>
+        </w:tc>
+        <w:tc>
+          <w:tcPr>
+            <w:tcW w:type="dxa" w:w="2880"/>
+          </w:tcPr>
+          <w:p>
+            <w:r>
+              <w:rPr>
+                <w:sz w:val="17"/>
+              </w:rPr>
+              <w:t>Account ID mapping (SCRUM-32)</w:t>
+            </w:r>
+          </w:p>
+        </w:tc>
+        <w:tc>
+          <w:tcPr>
+            <w:tcW w:type="dxa" w:w="2880"/>
+          </w:tcPr>
+          <w:p>
+            <w:r>
+              <w:rPr>
+                <w:sz w:val="17"/>
+              </w:rPr>
+              <w:t>Shared reference table maps every system's account ID to canonical A + 7 digits; set account_found_flag.</w:t>
             </w:r>
           </w:p>
         </w:tc>
@@ -6815,6 +7935,88 @@
           </w:p>
         </w:tc>
       </w:tr>
+      <w:tr>
+        <w:tc>
+          <w:tcPr>
+            <w:tcW w:type="dxa" w:w="2880"/>
+          </w:tcPr>
+          <w:p>
+            <w:r>
+              <w:rPr>
+                <w:sz w:val="17"/>
+              </w:rPr>
+              <w:t>DQ-13</w:t>
+            </w:r>
+          </w:p>
+        </w:tc>
+        <w:tc>
+          <w:tcPr>
+            <w:tcW w:type="dxa" w:w="2880"/>
+          </w:tcPr>
+          <w:p>
+            <w:r>
+              <w:rPr>
+                <w:sz w:val="17"/>
+              </w:rPr>
+              <w:t>assigned_queue allowed for case_type (only when a routing matrix is configured)</w:t>
+            </w:r>
+          </w:p>
+        </w:tc>
+        <w:tc>
+          <w:tcPr>
+            <w:tcW w:type="dxa" w:w="2880"/>
+          </w:tcPr>
+          <w:p>
+            <w:r>
+              <w:rPr>
+                <w:sz w:val="17"/>
+              </w:rPr>
+              <w:t>Medium – warn</w:t>
+            </w:r>
+          </w:p>
+        </w:tc>
+      </w:tr>
+      <w:tr>
+        <w:tc>
+          <w:tcPr>
+            <w:tcW w:type="dxa" w:w="2880"/>
+          </w:tcPr>
+          <w:p>
+            <w:r>
+              <w:rPr>
+                <w:sz w:val="17"/>
+              </w:rPr>
+              <w:t>DQ-14</w:t>
+            </w:r>
+          </w:p>
+        </w:tc>
+        <w:tc>
+          <w:tcPr>
+            <w:tcW w:type="dxa" w:w="2880"/>
+          </w:tcPr>
+          <w:p>
+            <w:r>
+              <w:rPr>
+                <w:sz w:val="17"/>
+              </w:rPr>
+              <w:t>Member match rate ≥ configured minimum (default 0 = never blocks)</w:t>
+            </w:r>
+          </w:p>
+        </w:tc>
+        <w:tc>
+          <w:tcPr>
+            <w:tcW w:type="dxa" w:w="2880"/>
+          </w:tcPr>
+          <w:p>
+            <w:r>
+              <w:rPr>
+                <w:sz w:val="17"/>
+              </w:rPr>
+              <w:t>Critical – block</w:t>
+            </w:r>
+          </w:p>
+        </w:tc>
+      </w:tr>
     </w:tbl>
     <w:p/>
     <w:p>
@@ -6830,7 +8032,23 @@
         <w:pStyle w:val="ListBullet"/>
       </w:pPr>
       <w:r>
-        <w:t>All 20 target columns present, with the physical types in section 6.</w:t>
+        <w:t>All 23 target columns present, with the physical types in section 6.</w:t>
+      </w:r>
+    </w:p>
+    <w:p>
+      <w:pPr>
+        <w:pStyle w:val="ListBullet"/>
+      </w:pPr>
+      <w:r>
+        <w:t>Open cases past SLA reported as CASE_SLA_BREACHED (27 at 2026-10-04: Critical 15, High 9, Medium 3).</w:t>
+      </w:r>
+    </w:p>
+    <w:p>
+      <w:pPr>
+        <w:pStyle w:val="ListBullet"/>
+      </w:pPr>
+      <w:r>
+        <w:t>90 cases flagged account_found_flag FALSE and reported as ACCOUNT_NOT_FOUND.</w:t>
       </w:r>
     </w:p>
     <w:p>
@@ -6865,6 +8083,14 @@
         <w:t>11. Open questions and data gaps</w:t>
       </w:r>
     </w:p>
+    <w:p>
+      <w:pPr>
+        <w:pStyle w:val="ListBullet"/>
+      </w:pPr>
+      <w:r>
+        <w:t>All seven questions now have a decision (OpenSpec change resolve-fraud-case-open-decisions). Items marked 'sign-off' are configurable defaults awaiting confirmation.</w:t>
+      </w:r>
+    </w:p>
     <w:tbl>
       <w:tblPr>
         <w:tblStyle w:val="TableGrid"/>
@@ -6922,7 +8148,7 @@
                 <w:color w:val="FFFFFF"/>
                 <w:sz w:val="18"/>
               </w:rPr>
-              <w:t>Impact</w:t>
+              <w:t>Decision</w:t>
             </w:r>
           </w:p>
         </w:tc>
@@ -6938,7 +8164,7 @@
                 <w:color w:val="FFFFFF"/>
                 <w:sz w:val="18"/>
               </w:rPr>
-              <w:t>Decision needed / owner</w:t>
+              <w:t>Status</w:t>
             </w:r>
           </w:p>
         </w:tc>
@@ -6979,7 +8205,7 @@
               <w:rPr>
                 <w:sz w:val="17"/>
               </w:rPr>
-              <w:t>90 cases unmatched (kept, flagged).</w:t>
+              <w:t>Keep and flag; DQ-14 records the match rate and blocks below Settings.min_member_match_rate (default 0). Raise once Member 360 has the full feed.</w:t>
             </w:r>
           </w:p>
         </w:tc>
@@ -6992,7 +8218,7 @@
               <w:rPr>
                 <w:sz w:val="17"/>
               </w:rPr>
-              <w:t>Full member feed into Member 360 – Data Eng</w:t>
+              <w:t>Decided</w:t>
             </w:r>
           </w:p>
         </w:tc>
@@ -7033,7 +8259,7 @@
               <w:rPr>
                 <w:sz w:val="17"/>
               </w:rPr>
-              <w:t>Can't link cases to accounts.</w:t>
+              <w:t>Canonical A + 7 digits via sources/data/reference/account_id_map.csv (SCRUM-32); account_found_flag + ACCOUNT_NOT_FOUND.</w:t>
             </w:r>
           </w:p>
         </w:tc>
@@ -7046,7 +8272,7 @@
               <w:rPr>
                 <w:sz w:val="17"/>
               </w:rPr>
-              <w:t>Confirm account ID standard / crosswalk – Data Eng</w:t>
+              <w:t>Decided</w:t>
             </w:r>
           </w:p>
         </w:tc>
@@ -7087,7 +8313,7 @@
               <w:rPr>
                 <w:sz w:val="17"/>
               </w:rPr>
-              <w:t>Day boundaries and SLAs could be off.</w:t>
+              <w:t>US Eastern (America/New_York), no offset; declared in the data contract.</w:t>
             </w:r>
           </w:p>
         </w:tc>
@@ -7100,7 +8326,7 @@
               <w:rPr>
                 <w:sz w:val="17"/>
               </w:rPr>
-              <w:t>Confirm time zone; are times rounded? – Fraud Ops</w:t>
+              <w:t>Decided</w:t>
             </w:r>
           </w:p>
         </w:tc>
@@ -7141,7 +8367,7 @@
               <w:rPr>
                 <w:sz w:val="17"/>
               </w:rPr>
-              <w:t>Queue metrics may mislead.</w:t>
+              <w:t>Not enforced; optional DQ-13 warning once Fraud Ops supplies a routing matrix.</w:t>
             </w:r>
           </w:p>
         </w:tc>
@@ -7154,7 +8380,7 @@
               <w:rPr>
                 <w:sz w:val="17"/>
               </w:rPr>
-              <w:t>Confirm routing rules – Fraud Ops</w:t>
+              <w:t>Decided – matrix pending</w:t>
             </w:r>
           </w:p>
         </w:tc>
@@ -7195,7 +8421,7 @@
               <w:rPr>
                 <w:sz w:val="17"/>
               </w:rPr>
-              <w:t>Possible SLA breach.</w:t>
+              <w:t>SLA by priority: Critical 30, High 45, Medium 60, Low 90 days; CASE_SLA_BREACHED replaces CRITICAL_CASE_AGED (BREAKING).</w:t>
             </w:r>
           </w:p>
         </w:tc>
@@ -7208,7 +8434,7 @@
               <w:rPr>
                 <w:sz w:val="17"/>
               </w:rPr>
-              <w:t>Define SLA days per priority – Fraud Ops</w:t>
+              <w:t>Decided – Fraud Ops sign-off</w:t>
             </w:r>
           </w:p>
         </w:tc>
@@ -7249,7 +8475,7 @@
               <w:rPr>
                 <w:sz w:val="17"/>
               </w:rPr>
-              <w:t>Rule severity choice.</w:t>
+              <w:t>Warn (DQ-10): fully recovered funds can leave $0 loss; switch to reject in Settings if needed.</w:t>
             </w:r>
           </w:p>
         </w:tc>
@@ -7262,7 +8488,7 @@
               <w:rPr>
                 <w:sz w:val="17"/>
               </w:rPr>
-              <w:t>Warn or reject? – Risk</w:t>
+              <w:t>Decided</w:t>
             </w:r>
           </w:p>
         </w:tc>
@@ -7303,7 +8529,7 @@
               <w:rPr>
                 <w:sz w:val="17"/>
               </w:rPr>
-              <w:t>Can't measure time in each status.</w:t>
+              <w:t>Daily fraud_case_status_snapshot (one row per case per run date); history from go-live.</w:t>
             </w:r>
           </w:p>
         </w:tc>
@@ -7316,7 +8542,7 @@
               <w:rPr>
                 <w:sz w:val="17"/>
               </w:rPr>
-              <w:t>Is a status-history feed available? – Fraud Ops</w:t>
+              <w:t>Decided</w:t>
             </w:r>
           </w:p>
         </w:tc>
@@ -7665,6 +8891,14 @@
       </w:pPr>
       <w:r>
         <w:t>output/DP_Member_360/04_code/out/member_360.csv — member lookup.</w:t>
+      </w:r>
+    </w:p>
+    <w:p>
+      <w:pPr>
+        <w:pStyle w:val="ListBullet"/>
+      </w:pPr>
+      <w:r>
+        <w:t>sources/data/reference/account_id_map.csv — 110 rows, account ID mapping reference table.</w:t>
       </w:r>
     </w:p>
     <w:p>

</xml_diff>